<commit_message>
feat: Update program flow with Keynotes Ms. Elduayan & Ms. Sta. Maria and synthesis session
</commit_message>
<xml_diff>
--- a/PECS_2026_Administrative_Letters.docx
+++ b/PECS_2026_Administrative_Letters.docx
@@ -106,12 +106,12 @@
     </w:p>
     <w:p>
       <w:r>
-        <w:t>The College of Hospitality and Tourism Management (CHTM) BAM 205 class respectfully requests permission to reserve and utilize the PHINMA-University of Pangasinan Gymnasium for the Pangasinan Eco-Haven &amp; Culinary Showcase 2026 (PECS 2026) conference on September 17, 2026, from 7:00 AM to 5:00 PM (inclusive of setup, operational hours, and teardown).</w:t>
+        <w:t>The College of Hospitality and Tourism Management (CHTM) BAM 205 class respectfully requests permission to reserve and utilize the PHINMA-University of Pangasinan Gymnasium for the Pangasinan Eco-Haven &amp; Culinary Showcase 2026 (PECS 2026) conference on Thursday, September 17, 2026, from 7:00 AM to 1:00 PM (inclusive of setup, operational hours, and teardown).</w:t>
       </w:r>
     </w:p>
     <w:p>
       <w:r>
-        <w:t>We also humbly request authorization for student committee members to remain on campus beyond standard hours during setup on September 16, 2026 (until 7:00 PM), along with technical assistance for the following:</w:t>
+        <w:t>We also humbly request authorization for student committee members to remain on campus during technical setup on September 16, 2026 (until 7:00 PM), along with logistics and technical support for:</w:t>
       </w:r>
     </w:p>
     <w:p>
@@ -120,7 +120,7 @@
         <w:ind w:left="576"/>
       </w:pPr>
       <w:r>
-        <w:t>1. Main stage projector / LED screen integration with HDMI connectivity.</w:t>
+        <w:t>1. Main stage projector / LED screen integration with HDMI connectivity for plenary slide decks.</w:t>
       </w:r>
     </w:p>
     <w:p>
@@ -129,7 +129,7 @@
         <w:ind w:left="576"/>
       </w:pPr>
       <w:r>
-        <w:t>2. Sound system setup: 1 podium microphone, 4 wireless handheld microphones, and 2 lapel mics.</w:t>
+        <w:t>2. Integrated sound system: 1 podium microphone, 4 wireless handheld microphones for interactive Q&amp;A, and 2 lapel mics for keynote speakers.</w:t>
       </w:r>
     </w:p>
     <w:p>
@@ -138,7 +138,7 @@
         <w:ind w:left="576"/>
       </w:pPr>
       <w:r>
-        <w:t>3. Stage podium and chairs for panel discussions, as well as 500 spectator chairs arranged theater-style on the gym floor.</w:t>
+        <w:t>3. Stage podium and chairs for plenary speakers, as well as 500 spectator chairs arranged theater-style on the gym floor.</w:t>
       </w:r>
     </w:p>
     <w:p>
@@ -147,12 +147,12 @@
         <w:ind w:left="576"/>
       </w:pPr>
       <w:r>
-        <w:t>4. Facility ventilation / cooling and lighting support throughout operational hours.</w:t>
+        <w:t>4. Facility ventilation / air cooling and full hall lighting support throughout operational hours.</w:t>
       </w:r>
     </w:p>
     <w:p>
       <w:r>
-        <w:t>This conference serves as the final practical output for our BAM 205 course. Thank you very much for your continued guidance and support of student academic endeavors.</w:t>
+        <w:t>This conference serves as the culminating practical output for our BAM 205 course. Thank you very much for your continuous guidance and support of student academic endeavors.</w:t>
       </w:r>
     </w:p>
     <w:p>
@@ -225,7 +225,7 @@
           <w:color w:val="1B4332"/>
           <w:sz w:val="25"/>
         </w:rPr>
-        <w:t>LETTER 2: OFFICIAL INVITATION TO KEYNOTE SPEAKER</w:t>
+        <w:t>LETTER 2A: OFFICIAL INVITATION — KEYNOTE SPEAKER 1</w:t>
       </w:r>
     </w:p>
     <w:p>
@@ -252,11 +252,11 @@
         <w:t xml:space="preserve">TO:       </w:t>
       </w:r>
       <w:r>
-        <w:t>[Speaker's Name / Professional Title]</w:t>
+        <w:t>MS. MARIA LUISA A. ELDUAYAN</w:t>
         <w:br/>
-        <w:t>[Position / Designation]</w:t>
+        <w:t>Provincial Tourism Officer</w:t>
         <w:br/>
-        <w:t>[Organization / Agency Name]</w:t>
+        <w:t>Provincial Tourism and Cultural Affairs Office (PTCAO) — Pangasinan</w:t>
       </w:r>
     </w:p>
     <w:p>
@@ -270,32 +270,207 @@
         <w:rPr>
           <w:b/>
         </w:rPr>
-        <w:t>Invitation as Keynote Speaker – PECS 2026 Regional Conference</w:t>
+        <w:t>Invitation as Keynote Speaker 1 – PECS 2026 Regional Conference</w:t>
       </w:r>
     </w:p>
     <w:p>
       <w:r>
-        <w:t>Dear [Speaker's Name],</w:t>
+        <w:t>Dear Ms. Elduayan,</w:t>
       </w:r>
     </w:p>
     <w:p>
       <w:r>
-        <w:t>Greetings from PHINMA University of Pangasinan!</w:t>
+        <w:t>Warm greetings from PHINMA University of Pangasinan!</w:t>
       </w:r>
     </w:p>
     <w:p>
       <w:r>
-        <w:t>The College of Hospitality and Tourism Management cordially invites you to serve as a Keynote Speaker for the Pangasinan Eco-Haven &amp; Culinary Showcase 2026 (PECS 2026) Conference on Thursday, September 17, 2026, at the PHINMA-UPang Gymnasium.</w:t>
+        <w:t>The College of Hospitality and Tourism Management cordially invites you to serve as our Keynote Speaker 1 for the Pangasinan Eco-Haven &amp; Culinary Showcase 2026 (PECS 2026) Conference on Thursday, September 17, 2026, at the PHINMA-UPang Gymnasium, Dagupan City.</w:t>
       </w:r>
     </w:p>
     <w:p>
       <w:r>
-        <w:t>Our conference theme, “Sustaining the Coastline: Strategies for Eco-Tourism Development and Heritage Culinary Preservation in Pangasinan,” aims to equip 500+ undergraduate delegates with actionable strategies for sustainable hospitality growth. Given your distinguished expertise in regional tourism frameworks and cultural preservation, we would be honored to have you deliver a 45-minute presentation followed by a 15-minute open Q&amp;A session.</w:t>
+        <w:t>Our conference theme, “Sustaining the Coastline: Strategies for Eco-Tourism Development and Heritage Culinary Preservation in Pangasinan,” convenes 500+ undergraduate hospitality and tourism delegates. In light of your visionary leadership in provincial destination management, we would be deeply honored to have you deliver a 40-minute keynote address on:</w:t>
+      </w:r>
+    </w:p>
+    <w:p>
+      <w:pPr>
+        <w:ind w:left="576"/>
+      </w:pPr>
+      <w:r>
+        <w:rPr>
+          <w:b/>
+          <w:color w:val="1B4332"/>
+        </w:rPr>
+        <w:t>“Protecting Pangasinan’s Shorelines: Sustainable Eco-Tourism Strategies and Carrying Capacity in Coastal Destinations”</w:t>
+      </w:r>
+      <w:r>
+        <w:br/>
+        <w:t>Scheduled Time: 9:00 AM – 9:40 AM (followed by Interactive Q&amp;A at 9:40 AM – 10:05 AM)</w:t>
       </w:r>
     </w:p>
     <w:p>
       <w:r>
-        <w:t>Dedicated VIP hospitality, honorarium, tokens of appreciation, and campus parking privileges will be provided throughout the event. We look forward to confirming your esteemed participation.</w:t>
+        <w:t>Dedicated VIP hospitality, honorarium, tokens of appreciation, and reserved campus parking will be provided. We look forward to confirming your gracious presence.</w:t>
+      </w:r>
+    </w:p>
+    <w:p>
+      <w:r>
+        <w:rPr>
+          <w:sz w:val="22"/>
+        </w:rPr>
+        <w:t>Warm regards,</w:t>
+        <w:br/>
+        <w:br/>
+        <w:br/>
+      </w:r>
+      <w:r>
+        <w:rPr>
+          <w:b/>
+        </w:rPr>
+        <w:t>[Your Name]</w:t>
+        <w:br/>
+      </w:r>
+      <w:r>
+        <w:t>Speaker Relations Lead, PECS 2026</w:t>
+        <w:br/>
+        <w:t>CHTM — PHINMA University of Pangasinan</w:t>
+      </w:r>
+    </w:p>
+    <w:p>
+      <w:r>
+        <w:br w:type="page"/>
+      </w:r>
+    </w:p>
+    <w:p>
+      <w:pPr>
+        <w:jc w:val="center"/>
+      </w:pPr>
+      <w:r>
+        <w:rPr>
+          <w:b/>
+          <w:color w:val="1B4332"/>
+          <w:sz w:val="24"/>
+        </w:rPr>
+        <w:t>PHINMA UNIVERSITY OF PANGASINAN</w:t>
+        <w:br/>
+      </w:r>
+      <w:r>
+        <w:rPr>
+          <w:b/>
+          <w:color w:val="D4AF37"/>
+          <w:sz w:val="22"/>
+        </w:rPr>
+        <w:t>COLLEGE OF HOSPITALITY AND TOURISM MANAGEMENT</w:t>
+        <w:br/>
+      </w:r>
+      <w:r>
+        <w:rPr>
+          <w:i/>
+          <w:color w:val="646E69"/>
+          <w:sz w:val="19"/>
+        </w:rPr>
+        <w:t>BAM 205: Meetings, Incentives, Conferences, and Exhibitions (MICE)</w:t>
+        <w:br/>
+      </w:r>
+    </w:p>
+    <w:p>
+      <w:pPr>
+        <w:jc w:val="center"/>
+      </w:pPr>
+      <w:r>
+        <w:rPr>
+          <w:b/>
+          <w:color w:val="1B4332"/>
+          <w:sz w:val="25"/>
+        </w:rPr>
+        <w:t>LETTER 2B: OFFICIAL INVITATION — KEYNOTE SPEAKER 2</w:t>
+      </w:r>
+    </w:p>
+    <w:p>
+      <w:pPr>
+        <w:spacing w:after="120"/>
+      </w:pPr>
+    </w:p>
+    <w:p>
+      <w:r>
+        <w:rPr>
+          <w:b/>
+        </w:rPr>
+        <w:t xml:space="preserve">Date: </w:t>
+      </w:r>
+      <w:r>
+        <w:t>September 2, 2026</w:t>
+      </w:r>
+    </w:p>
+    <w:p>
+      <w:r>
+        <w:rPr>
+          <w:b/>
+        </w:rPr>
+        <w:t xml:space="preserve">TO:       </w:t>
+      </w:r>
+      <w:r>
+        <w:t>MS. FELICE PRUDENTE STA. MARIA</w:t>
+        <w:br/>
+        <w:t>Renowned Culinary Historian, Author &amp; Cultural Heritage Advocate</w:t>
+        <w:br/>
+        <w:t>Manila / Pangasinan</w:t>
+      </w:r>
+    </w:p>
+    <w:p>
+      <w:r>
+        <w:rPr>
+          <w:b/>
+        </w:rPr>
+        <w:t xml:space="preserve">SUBJECT:  </w:t>
+      </w:r>
+      <w:r>
+        <w:rPr>
+          <w:b/>
+        </w:rPr>
+        <w:t>Invitation as Keynote Speaker 2 – PECS 2026 Regional Conference</w:t>
+      </w:r>
+    </w:p>
+    <w:p>
+      <w:r>
+        <w:t>Dear Ms. Sta. Maria,</w:t>
+      </w:r>
+    </w:p>
+    <w:p>
+      <w:r>
+        <w:t>Warm greetings from PHINMA University of Pangasinan!</w:t>
+      </w:r>
+    </w:p>
+    <w:p>
+      <w:r>
+        <w:t>The College of Hospitality and Tourism Management cordially invites you to serve as Keynote Speaker 2 for the Pangasinan Eco-Haven &amp; Culinary Showcase 2026 (PECS 2026) Conference on Thursday, September 17, 2026, at the PHINMA-UPang Gymnasium, Dagupan City.</w:t>
+      </w:r>
+    </w:p>
+    <w:p>
+      <w:r>
+        <w:t>Given your distinguished lifelong scholarship and pioneering work in Philippine culinary history and gastronomy tourism, we would be immensely privileged to host your 40-minute plenary lecture on:</w:t>
+      </w:r>
+    </w:p>
+    <w:p>
+      <w:pPr>
+        <w:ind w:left="576"/>
+      </w:pPr>
+      <w:r>
+        <w:rPr>
+          <w:b/>
+          <w:color w:val="1B4332"/>
+        </w:rPr>
+        <w:t>“From Coastal Waters to Heritage Plates: Preserving Pangasinan’s Culinary Identity in Modern Gastronomy Tourism”</w:t>
+      </w:r>
+      <w:r>
+        <w:br/>
+        <w:t>Scheduled Time: 10:05 AM – 10:45 AM (followed by Interactive Q&amp;A at 10:45 AM – 11:10 AM)</w:t>
+      </w:r>
+    </w:p>
+    <w:p>
+      <w:r>
+        <w:t>Dedicated VIP reception, full technical assistance, travel and accommodation arrangements, honorarium, and tokens will be provided. We eagerly anticipate your positive confirmation.</w:t>
       </w:r>
     </w:p>
     <w:p>
@@ -421,12 +596,12 @@
     </w:p>
     <w:p>
       <w:r>
-        <w:t>The organizing committee of PECS 2026 respectfully requests class excuse for participating BSHM and BSTM student organizers and registered delegates on Thursday, September 17, 2026, from 8:00 AM to 4:00 PM.</w:t>
+        <w:t>The organizing committee of PECS 2026 respectfully requests class excuse for participating BSHM and BSTM student organizers and registered delegates on Thursday, September 17, 2026, from 7:30 AM to 1:00 PM.</w:t>
       </w:r>
     </w:p>
     <w:p>
       <w:r>
-        <w:t>These students will be actively managing conference logistics, main-stage operations, secretariat desks, and participating in session discussions at the PHINMA-UPang Gymnasium to fulfill BAM 205 (MICE) course requirements. Participating students remain accountable for all academic responsibilities and missed lectures.</w:t>
+        <w:t>These students will be actively managing conference logistics, registration desks, stage AV operations, and participating in plenary keynote discussions at the PHINMA-UPang Gymnasium to fulfill BAM 205 (MICE) course requirements. Participating students remain accountable for all academic responsibilities and missed coursework.</w:t>
       </w:r>
     </w:p>
     <w:p>
@@ -586,9 +761,9 @@
           </w:tcPr>
           <w:p>
             <w:r>
-              <w:t>Thursday, September 17, 2026 | 7:00 AM – 5:00 PM</w:t>
+              <w:t>Thursday, September 17, 2026 | 7:00 AM – 1:00 PM</w:t>
               <w:br/>
-              <w:t>(Including ingress, conference sessions, and egress)</w:t>
+              <w:t>(Including ingress, plenary sessions, synthesis, and egress)</w:t>
             </w:r>
           </w:p>
         </w:tc>

</xml_diff>